<commit_message>
Add Binge App Store link to website and CV.
</commit_message>
<xml_diff>
--- a/assets/George_Amany_CV_2026.docx
+++ b/assets/George_Amany_CV_2026.docx
@@ -426,6 +426,18 @@
           <w:t>Google Play</w:t>
         </w:r>
       </w:hyperlink>
+      <w:r>
+        <w:t xml:space="preserve"> · </w:t>
+      </w:r>
+      <w:hyperlink r:id="rId17">
+        <w:r>
+          <w:rPr>
+            <w:color w:val="0F766E"/>
+            <w:u w:val="single"/>
+          </w:rPr>
+          <w:t>App Store</w:t>
+        </w:r>
+      </w:hyperlink>
     </w:p>
     <w:p>
       <w:pPr>
@@ -454,7 +466,7 @@
       <w:r>
         <w:t xml:space="preserve">Links: </w:t>
       </w:r>
-      <w:hyperlink r:id="rId17">
+      <w:hyperlink r:id="rId18">
         <w:r>
           <w:rPr>
             <w:color w:val="0F766E"/>
@@ -514,7 +526,7 @@
       <w:r>
         <w:t xml:space="preserve">Links: </w:t>
       </w:r>
-      <w:hyperlink r:id="rId18">
+      <w:hyperlink r:id="rId19">
         <w:r>
           <w:rPr>
             <w:color w:val="0F766E"/>
@@ -526,7 +538,7 @@
       <w:r>
         <w:t xml:space="preserve"> · </w:t>
       </w:r>
-      <w:hyperlink r:id="rId19">
+      <w:hyperlink r:id="rId20">
         <w:r>
           <w:rPr>
             <w:color w:val="0F766E"/>
@@ -563,7 +575,7 @@
       <w:r>
         <w:t xml:space="preserve">Links: </w:t>
       </w:r>
-      <w:hyperlink r:id="rId20">
+      <w:hyperlink r:id="rId21">
         <w:r>
           <w:rPr>
             <w:color w:val="0F766E"/>
@@ -575,7 +587,7 @@
       <w:r>
         <w:t xml:space="preserve"> · </w:t>
       </w:r>
-      <w:hyperlink r:id="rId21">
+      <w:hyperlink r:id="rId22">
         <w:r>
           <w:rPr>
             <w:color w:val="0F766E"/>
@@ -612,7 +624,7 @@
       <w:r>
         <w:t xml:space="preserve">Links: </w:t>
       </w:r>
-      <w:hyperlink r:id="rId22">
+      <w:hyperlink r:id="rId23">
         <w:r>
           <w:rPr>
             <w:color w:val="0F766E"/>
@@ -624,7 +636,7 @@
       <w:r>
         <w:t xml:space="preserve"> · </w:t>
       </w:r>
-      <w:hyperlink r:id="rId23">
+      <w:hyperlink r:id="rId24">
         <w:r>
           <w:rPr>
             <w:color w:val="0F766E"/>
@@ -661,7 +673,7 @@
       <w:r>
         <w:t xml:space="preserve">Links: </w:t>
       </w:r>
-      <w:hyperlink r:id="rId24">
+      <w:hyperlink r:id="rId25">
         <w:r>
           <w:rPr>
             <w:color w:val="0F766E"/>
@@ -673,7 +685,7 @@
       <w:r>
         <w:t xml:space="preserve"> · </w:t>
       </w:r>
-      <w:hyperlink r:id="rId25">
+      <w:hyperlink r:id="rId26">
         <w:r>
           <w:rPr>
             <w:color w:val="0F766E"/>

</xml_diff>

<commit_message>
Add Taleem Student and Staff App Store links to website and CV.
</commit_message>
<xml_diff>
--- a/assets/George_Amany_CV_2026.docx
+++ b/assets/George_Amany_CV_2026.docx
@@ -331,6 +331,32 @@
       </w:r>
     </w:p>
     <w:p>
+      <w:r>
+        <w:t xml:space="preserve">Links: </w:t>
+      </w:r>
+      <w:hyperlink r:id="rId15">
+        <w:r>
+          <w:rPr>
+            <w:color w:val="0F766E"/>
+            <w:u w:val="single"/>
+          </w:rPr>
+          <w:t>Student — App Store</w:t>
+        </w:r>
+      </w:hyperlink>
+      <w:r>
+        <w:t xml:space="preserve"> · </w:t>
+      </w:r>
+      <w:hyperlink r:id="rId16">
+        <w:r>
+          <w:rPr>
+            <w:color w:val="0F766E"/>
+            <w:u w:val="single"/>
+          </w:rPr>
+          <w:t>Staff — App Store</w:t>
+        </w:r>
+      </w:hyperlink>
+    </w:p>
+    <w:p>
       <w:pPr>
         <w:pStyle w:val="Heading2"/>
       </w:pPr>
@@ -357,7 +383,7 @@
       <w:r>
         <w:t xml:space="preserve">Links: </w:t>
       </w:r>
-      <w:hyperlink r:id="rId15">
+      <w:hyperlink r:id="rId17">
         <w:r>
           <w:rPr>
             <w:color w:val="0F766E"/>
@@ -417,7 +443,7 @@
       <w:r>
         <w:t xml:space="preserve">Links: </w:t>
       </w:r>
-      <w:hyperlink r:id="rId16">
+      <w:hyperlink r:id="rId18">
         <w:r>
           <w:rPr>
             <w:color w:val="0F766E"/>
@@ -429,7 +455,7 @@
       <w:r>
         <w:t xml:space="preserve"> · </w:t>
       </w:r>
-      <w:hyperlink r:id="rId17">
+      <w:hyperlink r:id="rId19">
         <w:r>
           <w:rPr>
             <w:color w:val="0F766E"/>
@@ -466,7 +492,7 @@
       <w:r>
         <w:t xml:space="preserve">Links: </w:t>
       </w:r>
-      <w:hyperlink r:id="rId18">
+      <w:hyperlink r:id="rId20">
         <w:r>
           <w:rPr>
             <w:color w:val="0F766E"/>
@@ -526,7 +552,7 @@
       <w:r>
         <w:t xml:space="preserve">Links: </w:t>
       </w:r>
-      <w:hyperlink r:id="rId19">
+      <w:hyperlink r:id="rId21">
         <w:r>
           <w:rPr>
             <w:color w:val="0F766E"/>
@@ -538,7 +564,7 @@
       <w:r>
         <w:t xml:space="preserve"> · </w:t>
       </w:r>
-      <w:hyperlink r:id="rId20">
+      <w:hyperlink r:id="rId22">
         <w:r>
           <w:rPr>
             <w:color w:val="0F766E"/>
@@ -575,7 +601,7 @@
       <w:r>
         <w:t xml:space="preserve">Links: </w:t>
       </w:r>
-      <w:hyperlink r:id="rId21">
+      <w:hyperlink r:id="rId23">
         <w:r>
           <w:rPr>
             <w:color w:val="0F766E"/>
@@ -587,7 +613,7 @@
       <w:r>
         <w:t xml:space="preserve"> · </w:t>
       </w:r>
-      <w:hyperlink r:id="rId22">
+      <w:hyperlink r:id="rId24">
         <w:r>
           <w:rPr>
             <w:color w:val="0F766E"/>
@@ -624,7 +650,7 @@
       <w:r>
         <w:t xml:space="preserve">Links: </w:t>
       </w:r>
-      <w:hyperlink r:id="rId23">
+      <w:hyperlink r:id="rId25">
         <w:r>
           <w:rPr>
             <w:color w:val="0F766E"/>
@@ -636,7 +662,7 @@
       <w:r>
         <w:t xml:space="preserve"> · </w:t>
       </w:r>
-      <w:hyperlink r:id="rId24">
+      <w:hyperlink r:id="rId26">
         <w:r>
           <w:rPr>
             <w:color w:val="0F766E"/>
@@ -673,7 +699,7 @@
       <w:r>
         <w:t xml:space="preserve">Links: </w:t>
       </w:r>
-      <w:hyperlink r:id="rId25">
+      <w:hyperlink r:id="rId27">
         <w:r>
           <w:rPr>
             <w:color w:val="0F766E"/>
@@ -685,7 +711,7 @@
       <w:r>
         <w:t xml:space="preserve"> · </w:t>
       </w:r>
-      <w:hyperlink r:id="rId26">
+      <w:hyperlink r:id="rId28">
         <w:r>
           <w:rPr>
             <w:color w:val="0F766E"/>

</xml_diff>